<commit_message>
TS 3.3 Kramam tamil
</commit_message>
<xml_diff>
--- a/TS-Kramam/TS-3.3/TS 3.3 Tamil Krama Paatam Corrections.docx
+++ b/TS-Kramam/TS-3.3/TS 3.3 Tamil Krama Paatam Corrections.docx
@@ -341,16 +341,743 @@
                 <w:sz w:val="28"/>
                 <w:szCs w:val="32"/>
               </w:rPr>
-              <w:t>5</w:t>
-            </w:r>
-            <w:r>
-              <w:rPr>
-                <w:rFonts w:cs="Arial"/>
-                <w:b/>
-                <w:sz w:val="28"/>
-                <w:szCs w:val="32"/>
-              </w:rPr>
-              <w:t>.1</w:t>
+              <w:t>3.3</w:t>
+            </w:r>
+            <w:r>
+              <w:rPr>
+                <w:rFonts w:cs="Arial"/>
+                <w:b/>
+                <w:sz w:val="28"/>
+                <w:szCs w:val="32"/>
+              </w:rPr>
+              <w:t xml:space="preserve"> – Kramam</w:t>
+            </w:r>
+          </w:p>
+          <w:p>
+            <w:pPr>
+              <w:widowControl w:val="0"/>
+              <w:tabs>
+                <w:tab w:val="left" w:pos="993"/>
+              </w:tabs>
+              <w:autoSpaceDE w:val="0"/>
+              <w:autoSpaceDN w:val="0"/>
+              <w:adjustRightInd w:val="0"/>
+              <w:spacing w:before="0" w:line="252" w:lineRule="auto"/>
+              <w:ind w:right="297"/>
+              <w:rPr>
+                <w:rFonts w:cs="Arial"/>
+                <w:b/>
+                <w:sz w:val="28"/>
+                <w:szCs w:val="32"/>
+              </w:rPr>
+            </w:pPr>
+            <w:r>
+              <w:rPr>
+                <w:rFonts w:cs="Arial"/>
+                <w:b/>
+                <w:sz w:val="28"/>
+                <w:szCs w:val="32"/>
+              </w:rPr>
+              <w:t>Krama Vaakyam No. -</w:t>
+            </w:r>
+            <w:r>
+              <w:rPr>
+                <w:rFonts w:cs="Arial"/>
+                <w:b/>
+                <w:sz w:val="28"/>
+                <w:szCs w:val="32"/>
+              </w:rPr>
+              <w:t xml:space="preserve"> 9</w:t>
+            </w:r>
+          </w:p>
+          <w:p>
+            <w:pPr>
+              <w:widowControl w:val="0"/>
+              <w:tabs>
+                <w:tab w:val="left" w:pos="993"/>
+              </w:tabs>
+              <w:autoSpaceDE w:val="0"/>
+              <w:autoSpaceDN w:val="0"/>
+              <w:adjustRightInd w:val="0"/>
+              <w:spacing w:before="0" w:line="252" w:lineRule="auto"/>
+              <w:ind w:right="297"/>
+              <w:rPr>
+                <w:rFonts w:cs="Arial"/>
+                <w:b/>
+                <w:sz w:val="28"/>
+                <w:szCs w:val="32"/>
+              </w:rPr>
+            </w:pPr>
+            <w:r>
+              <w:rPr>
+                <w:rFonts w:cs="Arial"/>
+                <w:b/>
+                <w:sz w:val="28"/>
+                <w:szCs w:val="32"/>
+              </w:rPr>
+              <w:t>Panchaati No</w:t>
+            </w:r>
+            <w:r>
+              <w:rPr>
+                <w:rFonts w:cs="Arial"/>
+                <w:b/>
+                <w:szCs w:val="32"/>
+              </w:rPr>
+              <w:t>. -</w:t>
+            </w:r>
+            <w:r>
+              <w:rPr>
+                <w:rFonts w:cs="Arial"/>
+                <w:b/>
+                <w:sz w:val="28"/>
+                <w:szCs w:val="28"/>
+              </w:rPr>
+              <w:t xml:space="preserve"> </w:t>
+            </w:r>
+            <w:r>
+              <w:rPr>
+                <w:rFonts w:cs="Arial"/>
+                <w:b/>
+                <w:sz w:val="28"/>
+                <w:szCs w:val="28"/>
+              </w:rPr>
+              <w:t>7</w:t>
+            </w:r>
+          </w:p>
+        </w:tc>
+        <w:tc>
+          <w:tcPr>
+            <w:tcW w:w="4819" w:type="dxa"/>
+          </w:tcPr>
+          <w:p>
+            <w:pPr>
+              <w:widowControl w:val="0"/>
+              <w:autoSpaceDE w:val="0"/>
+              <w:autoSpaceDN w:val="0"/>
+              <w:adjustRightInd w:val="0"/>
+              <w:spacing w:before="0" w:line="240" w:lineRule="auto"/>
+              <w:rPr>
+                <w:rFonts w:ascii="Latha" w:hAnsi="Latha" w:cs="Latha"/>
+                <w:b/>
+                <w:bCs/>
+                <w:i/>
+                <w:iCs/>
+                <w:sz w:val="28"/>
+                <w:szCs w:val="28"/>
+                <w:cs/>
+                <w:lang w:bidi="ta-IN"/>
+              </w:rPr>
+            </w:pPr>
+            <w:r>
+              <w:rPr>
+                <w:rFonts w:ascii="Latha" w:hAnsi="Latha" w:cs="Latha"/>
+                <w:sz w:val="28"/>
+                <w:szCs w:val="28"/>
+                <w:cs/>
+                <w:lang w:bidi="ta-IN"/>
+              </w:rPr>
+              <w:t>ஸோ</w:t>
+            </w:r>
+            <w:r>
+              <w:rPr>
+                <w:rFonts w:ascii="BRH Tamil Tab Extra" w:hAnsi="BRH Tamil Tab Extra" w:cs="Latha"/>
+                <w:b/>
+                <w:sz w:val="32"/>
+                <w:szCs w:val="28"/>
+                <w:lang w:bidi="ta-IN"/>
+              </w:rPr>
+              <w:t>…</w:t>
+            </w:r>
+            <w:r>
+              <w:rPr>
+                <w:rFonts w:ascii="Latha" w:hAnsi="Latha" w:cs="Latha"/>
+                <w:sz w:val="28"/>
+                <w:szCs w:val="28"/>
+                <w:cs/>
+                <w:lang w:bidi="ta-IN"/>
+              </w:rPr>
+              <w:t>ம</w:t>
+            </w:r>
+            <w:r>
+              <w:rPr>
+                <w:rFonts w:ascii="BRH Tamil Tab Extra" w:hAnsi="BRH Tamil Tab Extra" w:cs="Latha"/>
+                <w:b/>
+                <w:sz w:val="32"/>
+                <w:szCs w:val="28"/>
+                <w:lang w:bidi="ta-IN"/>
+              </w:rPr>
+              <w:t>…</w:t>
+            </w:r>
+            <w:r>
+              <w:rPr>
+                <w:rFonts w:ascii="Latha" w:hAnsi="Latha" w:cs="Latha"/>
+                <w:sz w:val="28"/>
+                <w:szCs w:val="28"/>
+                <w:lang w:bidi="ta-IN"/>
+              </w:rPr>
+              <w:t xml:space="preserve"> </w:t>
+            </w:r>
+            <w:r>
+              <w:rPr>
+                <w:rFonts w:ascii="Latha" w:hAnsi="Latha" w:cs="Latha"/>
+                <w:sz w:val="28"/>
+                <w:szCs w:val="28"/>
+                <w:cs/>
+                <w:lang w:bidi="ta-IN"/>
+              </w:rPr>
+              <w:t>த்ரைஷ்டு</w:t>
+            </w:r>
+            <w:r>
+              <w:rPr>
+                <w:rFonts w:ascii="BRH Tamil Tab Extra" w:hAnsi="BRH Tamil Tab Extra" w:cs="Latha"/>
+                <w:b/>
+                <w:sz w:val="36"/>
+                <w:szCs w:val="28"/>
+                <w:lang w:bidi="ta-IN"/>
+              </w:rPr>
+              <w:t>†</w:t>
+            </w:r>
+            <w:r>
+              <w:rPr>
+                <w:rFonts w:ascii="Latha" w:hAnsi="Latha" w:cs="Latha"/>
+                <w:sz w:val="28"/>
+                <w:szCs w:val="28"/>
+                <w:cs/>
+                <w:lang w:bidi="ta-IN"/>
+              </w:rPr>
+              <w:t>பே</w:t>
+            </w:r>
+            <w:r>
+              <w:rPr>
+                <w:rFonts w:ascii="Latha" w:hAnsi="Latha" w:cs="Latha"/>
+                <w:b/>
+                <w:bCs/>
+                <w:position w:val="-12"/>
+                <w:sz w:val="28"/>
+                <w:szCs w:val="28"/>
+                <w:cs/>
+                <w:lang w:bidi="ta-IN"/>
+              </w:rPr>
+              <w:t>4</w:t>
+            </w:r>
+            <w:r>
+              <w:rPr>
+                <w:rFonts w:ascii="Latha" w:hAnsi="Latha" w:cs="Latha"/>
+                <w:sz w:val="28"/>
+                <w:szCs w:val="28"/>
+                <w:cs/>
+                <w:lang w:bidi="ta-IN"/>
+              </w:rPr>
+              <w:t xml:space="preserve">ன </w:t>
+            </w:r>
+            <w:r>
+              <w:rPr>
+                <w:rFonts w:ascii="Latha" w:hAnsi="Latha" w:cs="Latha"/>
+                <w:sz w:val="28"/>
+                <w:szCs w:val="28"/>
+                <w:lang w:bidi="ta-IN"/>
+              </w:rPr>
+              <w:t xml:space="preserve">| </w:t>
+            </w:r>
+            <w:r>
+              <w:rPr>
+                <w:rFonts w:ascii="Latha" w:hAnsi="Latha" w:cs="Latha"/>
+                <w:sz w:val="28"/>
+                <w:szCs w:val="28"/>
+                <w:cs/>
+                <w:lang w:bidi="ta-IN"/>
+              </w:rPr>
+              <w:t>த்ரைஷ்</w:t>
+            </w:r>
+            <w:r>
+              <w:rPr>
+                <w:rFonts w:ascii="Latha" w:hAnsi="Latha" w:cs="Latha"/>
+                <w:sz w:val="28"/>
+                <w:szCs w:val="28"/>
+                <w:highlight w:val="yellow"/>
+                <w:cs/>
+                <w:lang w:bidi="ta-IN"/>
+              </w:rPr>
+              <w:t>ட</w:t>
+            </w:r>
+            <w:r>
+              <w:rPr>
+                <w:rFonts w:ascii="BRH Tamil Tab Extra" w:hAnsi="BRH Tamil Tab Extra" w:cs="Latha"/>
+                <w:b/>
+                <w:sz w:val="36"/>
+                <w:szCs w:val="28"/>
+                <w:lang w:bidi="ta-IN"/>
+              </w:rPr>
+              <w:t>†</w:t>
+            </w:r>
+            <w:r>
+              <w:rPr>
+                <w:rFonts w:ascii="Latha" w:hAnsi="Latha" w:cs="Latha"/>
+                <w:sz w:val="28"/>
+                <w:szCs w:val="28"/>
+                <w:cs/>
+                <w:lang w:bidi="ta-IN"/>
+              </w:rPr>
+              <w:t>பே</w:t>
+            </w:r>
+            <w:r>
+              <w:rPr>
+                <w:rFonts w:ascii="Latha" w:hAnsi="Latha" w:cs="Latha"/>
+                <w:b/>
+                <w:bCs/>
+                <w:position w:val="-12"/>
+                <w:sz w:val="28"/>
+                <w:szCs w:val="28"/>
+                <w:cs/>
+                <w:lang w:bidi="ta-IN"/>
+              </w:rPr>
+              <w:t>4</w:t>
+            </w:r>
+            <w:r>
+              <w:rPr>
+                <w:rFonts w:ascii="Latha" w:hAnsi="Latha" w:cs="Latha"/>
+                <w:sz w:val="28"/>
+                <w:szCs w:val="28"/>
+                <w:cs/>
+                <w:lang w:bidi="ta-IN"/>
+              </w:rPr>
+              <w:t>ன</w:t>
+            </w:r>
+            <w:r>
+              <w:rPr>
+                <w:rFonts w:ascii="BRH Tamil Tab Extra" w:hAnsi="BRH Tamil Tab Extra" w:cs="Latha"/>
+                <w:b/>
+                <w:sz w:val="32"/>
+                <w:szCs w:val="28"/>
+                <w:lang w:bidi="ta-IN"/>
+              </w:rPr>
+              <w:t>…</w:t>
+            </w:r>
+            <w:r>
+              <w:rPr>
+                <w:rFonts w:ascii="Latha" w:hAnsi="Latha" w:cs="Latha"/>
+                <w:sz w:val="28"/>
+                <w:szCs w:val="28"/>
+                <w:lang w:bidi="ta-IN"/>
+              </w:rPr>
+              <w:t xml:space="preserve"> </w:t>
+            </w:r>
+            <w:r>
+              <w:rPr>
+                <w:rFonts w:ascii="Latha" w:hAnsi="Latha" w:cs="Latha"/>
+                <w:sz w:val="28"/>
+                <w:szCs w:val="28"/>
+                <w:cs/>
+                <w:lang w:bidi="ta-IN"/>
+              </w:rPr>
+              <w:t>ச</w:t>
+            </w:r>
+            <w:r>
+              <w:rPr>
+                <w:rFonts w:ascii="Latha" w:hAnsi="Latha" w:cs="Latha"/>
+                <w:b/>
+                <w:bCs/>
+                <w:position w:val="-12"/>
+                <w:sz w:val="28"/>
+                <w:szCs w:val="28"/>
+                <w:cs/>
+                <w:lang w:bidi="ta-IN"/>
+              </w:rPr>
+              <w:t>2</w:t>
+            </w:r>
+            <w:r>
+              <w:rPr>
+                <w:rFonts w:ascii="Latha" w:hAnsi="Latha" w:cs="Latha"/>
+                <w:sz w:val="28"/>
+                <w:szCs w:val="28"/>
+                <w:cs/>
+                <w:lang w:bidi="ta-IN"/>
+              </w:rPr>
+              <w:t>ந்த</w:t>
+            </w:r>
+            <w:r>
+              <w:rPr>
+                <w:rFonts w:ascii="BRH Tamil Tab Extra" w:hAnsi="BRH Tamil Tab Extra" w:cs="Latha"/>
+                <w:b/>
+                <w:sz w:val="36"/>
+                <w:szCs w:val="28"/>
+                <w:lang w:bidi="ta-IN"/>
+              </w:rPr>
+              <w:t>†</w:t>
+            </w:r>
+            <w:r>
+              <w:rPr>
+                <w:rFonts w:ascii="Latha" w:hAnsi="Latha" w:cs="Latha"/>
+                <w:b/>
+                <w:bCs/>
+                <w:position w:val="-12"/>
+                <w:sz w:val="28"/>
+                <w:szCs w:val="28"/>
+                <w:cs/>
+                <w:lang w:bidi="ta-IN"/>
+              </w:rPr>
+              <w:t>3</w:t>
+            </w:r>
+            <w:r>
+              <w:rPr>
+                <w:rFonts w:ascii="Latha" w:hAnsi="Latha" w:cs="Latha"/>
+                <w:sz w:val="28"/>
+                <w:szCs w:val="28"/>
+                <w:cs/>
+                <w:lang w:bidi="ta-IN"/>
+              </w:rPr>
+              <w:t xml:space="preserve">ஸா </w:t>
+            </w:r>
+            <w:r>
+              <w:rPr>
+                <w:rFonts w:ascii="Latha" w:hAnsi="Latha" w:cs="Latha"/>
+                <w:sz w:val="28"/>
+                <w:szCs w:val="28"/>
+                <w:lang w:bidi="ta-IN"/>
+              </w:rPr>
+              <w:t>|</w:t>
+            </w:r>
+          </w:p>
+        </w:tc>
+        <w:tc>
+          <w:tcPr>
+            <w:tcW w:w="5103" w:type="dxa"/>
+          </w:tcPr>
+          <w:p>
+            <w:pPr>
+              <w:widowControl w:val="0"/>
+              <w:autoSpaceDE w:val="0"/>
+              <w:autoSpaceDN w:val="0"/>
+              <w:adjustRightInd w:val="0"/>
+              <w:spacing w:before="0" w:line="240" w:lineRule="auto"/>
+              <w:rPr>
+                <w:rFonts w:ascii="Latha" w:hAnsi="Latha" w:cs="Latha"/>
+                <w:b/>
+                <w:bCs/>
+                <w:i/>
+                <w:iCs/>
+                <w:sz w:val="28"/>
+                <w:szCs w:val="28"/>
+                <w:cs/>
+                <w:lang w:bidi="ta-IN"/>
+              </w:rPr>
+            </w:pPr>
+            <w:r>
+              <w:rPr>
+                <w:rFonts w:ascii="Latha" w:hAnsi="Latha" w:cs="Latha"/>
+                <w:sz w:val="28"/>
+                <w:szCs w:val="28"/>
+                <w:cs/>
+                <w:lang w:bidi="ta-IN"/>
+              </w:rPr>
+              <w:t>ஸோ</w:t>
+            </w:r>
+            <w:r>
+              <w:rPr>
+                <w:rFonts w:ascii="BRH Tamil Tab Extra" w:hAnsi="BRH Tamil Tab Extra" w:cs="Latha"/>
+                <w:b/>
+                <w:sz w:val="32"/>
+                <w:szCs w:val="28"/>
+                <w:lang w:bidi="ta-IN"/>
+              </w:rPr>
+              <w:t>…</w:t>
+            </w:r>
+            <w:r>
+              <w:rPr>
+                <w:rFonts w:ascii="Latha" w:hAnsi="Latha" w:cs="Latha"/>
+                <w:sz w:val="28"/>
+                <w:szCs w:val="28"/>
+                <w:cs/>
+                <w:lang w:bidi="ta-IN"/>
+              </w:rPr>
+              <w:t>ம</w:t>
+            </w:r>
+            <w:r>
+              <w:rPr>
+                <w:rFonts w:ascii="BRH Tamil Tab Extra" w:hAnsi="BRH Tamil Tab Extra" w:cs="Latha"/>
+                <w:b/>
+                <w:sz w:val="32"/>
+                <w:szCs w:val="28"/>
+                <w:lang w:bidi="ta-IN"/>
+              </w:rPr>
+              <w:t>…</w:t>
+            </w:r>
+            <w:r>
+              <w:rPr>
+                <w:rFonts w:ascii="Latha" w:hAnsi="Latha" w:cs="Latha"/>
+                <w:sz w:val="28"/>
+                <w:szCs w:val="28"/>
+                <w:lang w:bidi="ta-IN"/>
+              </w:rPr>
+              <w:t xml:space="preserve"> </w:t>
+            </w:r>
+            <w:r>
+              <w:rPr>
+                <w:rFonts w:ascii="Latha" w:hAnsi="Latha" w:cs="Latha"/>
+                <w:sz w:val="28"/>
+                <w:szCs w:val="28"/>
+                <w:cs/>
+                <w:lang w:bidi="ta-IN"/>
+              </w:rPr>
+              <w:t>த்ரைஷ்டு</w:t>
+            </w:r>
+            <w:r>
+              <w:rPr>
+                <w:rFonts w:ascii="BRH Tamil Tab Extra" w:hAnsi="BRH Tamil Tab Extra" w:cs="Latha"/>
+                <w:b/>
+                <w:sz w:val="36"/>
+                <w:szCs w:val="28"/>
+                <w:lang w:bidi="ta-IN"/>
+              </w:rPr>
+              <w:t>†</w:t>
+            </w:r>
+            <w:r>
+              <w:rPr>
+                <w:rFonts w:ascii="Latha" w:hAnsi="Latha" w:cs="Latha"/>
+                <w:sz w:val="28"/>
+                <w:szCs w:val="28"/>
+                <w:cs/>
+                <w:lang w:bidi="ta-IN"/>
+              </w:rPr>
+              <w:t>பே</w:t>
+            </w:r>
+            <w:r>
+              <w:rPr>
+                <w:rFonts w:ascii="Latha" w:hAnsi="Latha" w:cs="Latha"/>
+                <w:b/>
+                <w:bCs/>
+                <w:position w:val="-12"/>
+                <w:sz w:val="28"/>
+                <w:szCs w:val="28"/>
+                <w:cs/>
+                <w:lang w:bidi="ta-IN"/>
+              </w:rPr>
+              <w:t>4</w:t>
+            </w:r>
+            <w:r>
+              <w:rPr>
+                <w:rFonts w:ascii="Latha" w:hAnsi="Latha" w:cs="Latha"/>
+                <w:sz w:val="28"/>
+                <w:szCs w:val="28"/>
+                <w:cs/>
+                <w:lang w:bidi="ta-IN"/>
+              </w:rPr>
+              <w:t xml:space="preserve">ன </w:t>
+            </w:r>
+            <w:r>
+              <w:rPr>
+                <w:rFonts w:ascii="Latha" w:hAnsi="Latha" w:cs="Latha"/>
+                <w:sz w:val="28"/>
+                <w:szCs w:val="28"/>
+                <w:lang w:bidi="ta-IN"/>
+              </w:rPr>
+              <w:t xml:space="preserve">| </w:t>
+            </w:r>
+            <w:r>
+              <w:rPr>
+                <w:rFonts w:ascii="Latha" w:hAnsi="Latha" w:cs="Latha"/>
+                <w:sz w:val="28"/>
+                <w:szCs w:val="28"/>
+                <w:cs/>
+                <w:lang w:bidi="ta-IN"/>
+              </w:rPr>
+              <w:t>த்ரைஷ்</w:t>
+            </w:r>
+            <w:r>
+              <w:rPr>
+                <w:rFonts w:ascii="Latha" w:hAnsi="Latha" w:cs="Latha"/>
+                <w:sz w:val="28"/>
+                <w:szCs w:val="28"/>
+                <w:highlight w:val="green"/>
+                <w:cs/>
+                <w:lang w:bidi="ta-IN"/>
+              </w:rPr>
+              <w:t>டு</w:t>
+            </w:r>
+            <w:r>
+              <w:rPr>
+                <w:rFonts w:ascii="BRH Tamil Tab Extra" w:hAnsi="BRH Tamil Tab Extra" w:cs="Latha"/>
+                <w:b/>
+                <w:sz w:val="36"/>
+                <w:szCs w:val="28"/>
+                <w:highlight w:val="green"/>
+                <w:lang w:bidi="ta-IN"/>
+              </w:rPr>
+              <w:t>†</w:t>
+            </w:r>
+            <w:r>
+              <w:rPr>
+                <w:rFonts w:ascii="Latha" w:hAnsi="Latha" w:cs="Latha"/>
+                <w:sz w:val="28"/>
+                <w:szCs w:val="28"/>
+                <w:cs/>
+                <w:lang w:bidi="ta-IN"/>
+              </w:rPr>
+              <w:t>பே</w:t>
+            </w:r>
+            <w:r>
+              <w:rPr>
+                <w:rFonts w:ascii="Latha" w:hAnsi="Latha" w:cs="Latha"/>
+                <w:b/>
+                <w:bCs/>
+                <w:position w:val="-12"/>
+                <w:sz w:val="28"/>
+                <w:szCs w:val="28"/>
+                <w:cs/>
+                <w:lang w:bidi="ta-IN"/>
+              </w:rPr>
+              <w:t>4</w:t>
+            </w:r>
+            <w:r>
+              <w:rPr>
+                <w:rFonts w:ascii="Latha" w:hAnsi="Latha" w:cs="Latha"/>
+                <w:sz w:val="28"/>
+                <w:szCs w:val="28"/>
+                <w:cs/>
+                <w:lang w:bidi="ta-IN"/>
+              </w:rPr>
+              <w:t>ன</w:t>
+            </w:r>
+            <w:r>
+              <w:rPr>
+                <w:rFonts w:ascii="BRH Tamil Tab Extra" w:hAnsi="BRH Tamil Tab Extra" w:cs="Latha"/>
+                <w:b/>
+                <w:sz w:val="32"/>
+                <w:szCs w:val="28"/>
+                <w:lang w:bidi="ta-IN"/>
+              </w:rPr>
+              <w:t>…</w:t>
+            </w:r>
+            <w:r>
+              <w:rPr>
+                <w:rFonts w:ascii="Latha" w:hAnsi="Latha" w:cs="Latha"/>
+                <w:sz w:val="28"/>
+                <w:szCs w:val="28"/>
+                <w:lang w:bidi="ta-IN"/>
+              </w:rPr>
+              <w:t xml:space="preserve"> </w:t>
+            </w:r>
+            <w:r>
+              <w:rPr>
+                <w:rFonts w:ascii="Latha" w:hAnsi="Latha" w:cs="Latha"/>
+                <w:sz w:val="28"/>
+                <w:szCs w:val="28"/>
+                <w:cs/>
+                <w:lang w:bidi="ta-IN"/>
+              </w:rPr>
+              <w:t>ச</w:t>
+            </w:r>
+            <w:r>
+              <w:rPr>
+                <w:rFonts w:ascii="Latha" w:hAnsi="Latha" w:cs="Latha"/>
+                <w:b/>
+                <w:bCs/>
+                <w:position w:val="-12"/>
+                <w:sz w:val="28"/>
+                <w:szCs w:val="28"/>
+                <w:cs/>
+                <w:lang w:bidi="ta-IN"/>
+              </w:rPr>
+              <w:t>2</w:t>
+            </w:r>
+            <w:r>
+              <w:rPr>
+                <w:rFonts w:ascii="Latha" w:hAnsi="Latha" w:cs="Latha"/>
+                <w:sz w:val="28"/>
+                <w:szCs w:val="28"/>
+                <w:cs/>
+                <w:lang w:bidi="ta-IN"/>
+              </w:rPr>
+              <w:t>ந்த</w:t>
+            </w:r>
+            <w:r>
+              <w:rPr>
+                <w:rFonts w:ascii="BRH Tamil Tab Extra" w:hAnsi="BRH Tamil Tab Extra" w:cs="Latha"/>
+                <w:b/>
+                <w:sz w:val="36"/>
+                <w:szCs w:val="28"/>
+                <w:lang w:bidi="ta-IN"/>
+              </w:rPr>
+              <w:t>†</w:t>
+            </w:r>
+            <w:r>
+              <w:rPr>
+                <w:rFonts w:ascii="Latha" w:hAnsi="Latha" w:cs="Latha"/>
+                <w:b/>
+                <w:bCs/>
+                <w:position w:val="-12"/>
+                <w:sz w:val="28"/>
+                <w:szCs w:val="28"/>
+                <w:cs/>
+                <w:lang w:bidi="ta-IN"/>
+              </w:rPr>
+              <w:t>3</w:t>
+            </w:r>
+            <w:r>
+              <w:rPr>
+                <w:rFonts w:ascii="Latha" w:hAnsi="Latha" w:cs="Latha"/>
+                <w:sz w:val="28"/>
+                <w:szCs w:val="28"/>
+                <w:cs/>
+                <w:lang w:bidi="ta-IN"/>
+              </w:rPr>
+              <w:t xml:space="preserve">ஸா </w:t>
+            </w:r>
+            <w:r>
+              <w:rPr>
+                <w:rFonts w:ascii="Latha" w:hAnsi="Latha" w:cs="Latha"/>
+                <w:sz w:val="28"/>
+                <w:szCs w:val="28"/>
+                <w:lang w:bidi="ta-IN"/>
+              </w:rPr>
+              <w:t>|</w:t>
+            </w:r>
+          </w:p>
+        </w:tc>
+      </w:tr>
+      <w:tr>
+        <w:trPr>
+          <w:trHeight w:val="918"/>
+        </w:trPr>
+        <w:tc>
+          <w:tcPr>
+            <w:tcW w:w="3970" w:type="dxa"/>
+          </w:tcPr>
+          <w:p>
+            <w:pPr>
+              <w:widowControl w:val="0"/>
+              <w:tabs>
+                <w:tab w:val="left" w:pos="993"/>
+              </w:tabs>
+              <w:autoSpaceDE w:val="0"/>
+              <w:autoSpaceDN w:val="0"/>
+              <w:adjustRightInd w:val="0"/>
+              <w:spacing w:before="0" w:line="252" w:lineRule="auto"/>
+              <w:ind w:right="297"/>
+              <w:rPr>
+                <w:rFonts w:cs="Arial"/>
+                <w:b/>
+                <w:sz w:val="28"/>
+                <w:szCs w:val="32"/>
+              </w:rPr>
+            </w:pPr>
+            <w:r>
+              <w:rPr>
+                <w:rFonts w:cs="Arial"/>
+                <w:b/>
+                <w:sz w:val="28"/>
+                <w:szCs w:val="32"/>
+              </w:rPr>
+              <w:t>T.S.3.3.</w:t>
+            </w:r>
+            <w:r>
+              <w:rPr>
+                <w:rFonts w:cs="Arial"/>
+                <w:b/>
+                <w:sz w:val="28"/>
+                <w:szCs w:val="32"/>
+              </w:rPr>
+              <w:t>5.1</w:t>
             </w:r>
             <w:r>
               <w:rPr>
@@ -2307,6 +3034,7 @@
           <w:szCs w:val="32"/>
           <w:u w:val="single"/>
         </w:rPr>
+        <w:lastRenderedPageBreak/>
         <w:t>==================</w:t>
       </w:r>
     </w:p>
@@ -4641,6 +5369,7 @@
           <w:szCs w:val="40"/>
           <w:lang w:val="en-IN" w:eastAsia="en-IN"/>
         </w:rPr>
+        <w:lastRenderedPageBreak/>
         <w:t>"</w:t>
       </w:r>
       <w:proofErr w:type="spellStart"/>
@@ -4875,7 +5604,6 @@
                 <w:sz w:val="32"/>
                 <w:szCs w:val="32"/>
               </w:rPr>
-              <w:lastRenderedPageBreak/>
               <w:t>Section, Paragraph</w:t>
             </w:r>
           </w:p>
@@ -5936,7 +6664,7 @@
   <w:style w:type="paragraph" w:default="1" w:styleId="Normal">
     <w:name w:val="Normal"/>
     <w:qFormat/>
-    <w:rsid w:val="001B15CC"/>
+    <w:rsid w:val="005D05F4"/>
     <w:pPr>
       <w:spacing w:before="120" w:line="276" w:lineRule="auto"/>
     </w:pPr>

</xml_diff>